<commit_message>
final ms update for journal
</commit_message>
<xml_diff>
--- a/writing/r3_main_document.docx
+++ b/writing/r3_main_document.docx
@@ -36020,7 +36020,15 @@
           <w:b/>
           <w:bCs/>
         </w:rPr>
-        <w:t>. Figure Captions</w:t>
+        <w:t>. Figure Caption</w:t>
+      </w:r>
+      <w:r>
+        <w:rPr>
+          <w:rFonts w:ascii="Arial" w:hAnsi="Arial" w:cs="Arial"/>
+          <w:b/>
+          <w:bCs/>
+        </w:rPr>
+        <w:t xml:space="preserve"> Alt Text</w:t>
       </w:r>
     </w:p>
     <w:p>
@@ -36040,327 +36048,6 @@
           <w14:ligatures w14:val="none"/>
         </w:rPr>
         <w:t>Figure 1.</w:t>
-      </w:r>
-      <w:r>
-        <w:rPr>
-          <w:rFonts w:ascii="Arial" w:eastAsia="Times New Roman" w:hAnsi="Arial" w:cs="Arial"/>
-          <w:b/>
-          <w:bCs/>
-          <w:color w:val="000000"/>
-          <w:kern w:val="0"/>
-          <w14:ligatures w14:val="none"/>
-        </w:rPr>
-        <w:t xml:space="preserve"> </w:t>
-      </w:r>
-      <w:r>
-        <w:rPr>
-          <w:rFonts w:ascii="Arial" w:eastAsia="Times New Roman" w:hAnsi="Arial" w:cs="Arial"/>
-          <w:color w:val="000000"/>
-          <w:kern w:val="0"/>
-          <w14:ligatures w14:val="none"/>
-        </w:rPr>
-        <w:t>Hypothesized relationships among</w:t>
-      </w:r>
-      <w:r>
-        <w:rPr>
-          <w:rFonts w:ascii="Arial" w:eastAsia="Times New Roman" w:hAnsi="Arial" w:cs="Arial"/>
-          <w:color w:val="000000"/>
-          <w:kern w:val="0"/>
-          <w14:ligatures w14:val="none"/>
-        </w:rPr>
-        <w:t xml:space="preserve"> largemouth</w:t>
-      </w:r>
-      <w:r>
-        <w:rPr>
-          <w:rFonts w:ascii="Arial" w:eastAsia="Times New Roman" w:hAnsi="Arial" w:cs="Arial"/>
-          <w:color w:val="000000"/>
-          <w:kern w:val="0"/>
-          <w14:ligatures w14:val="none"/>
-        </w:rPr>
-        <w:t xml:space="preserve"> bass </w:t>
-      </w:r>
-      <w:r>
-        <w:rPr>
-          <w:rFonts w:ascii="Arial" w:eastAsia="Times New Roman" w:hAnsi="Arial" w:cs="Arial"/>
-          <w:color w:val="000000"/>
-          <w:kern w:val="0"/>
-          <w14:ligatures w14:val="none"/>
-        </w:rPr>
-        <w:t>neutrophil-to-lymphocyte ratios (NLR)</w:t>
-      </w:r>
-      <w:r>
-        <w:rPr>
-          <w:rFonts w:ascii="Arial" w:eastAsia="Times New Roman" w:hAnsi="Arial" w:cs="Arial"/>
-          <w:color w:val="000000"/>
-          <w:kern w:val="0"/>
-          <w14:ligatures w14:val="none"/>
-        </w:rPr>
-        <w:t xml:space="preserve">, low and high levels of </w:t>
-      </w:r>
-      <w:r>
-        <w:rPr>
-          <w:rFonts w:ascii="Arial" w:eastAsia="Times New Roman" w:hAnsi="Arial" w:cs="Arial"/>
-          <w:color w:val="000000"/>
-          <w:kern w:val="0"/>
-          <w14:ligatures w14:val="none"/>
-        </w:rPr>
-        <w:t>cadmium (</w:t>
-      </w:r>
-      <w:r>
-        <w:rPr>
-          <w:rFonts w:ascii="Arial" w:eastAsia="Times New Roman" w:hAnsi="Arial" w:cs="Arial"/>
-          <w:color w:val="000000"/>
-          <w:kern w:val="0"/>
-          <w14:ligatures w14:val="none"/>
-        </w:rPr>
-        <w:t>Cd</w:t>
-      </w:r>
-      <w:r>
-        <w:rPr>
-          <w:rFonts w:ascii="Arial" w:eastAsia="Times New Roman" w:hAnsi="Arial" w:cs="Arial"/>
-          <w:color w:val="000000"/>
-          <w:kern w:val="0"/>
-          <w14:ligatures w14:val="none"/>
-        </w:rPr>
-        <w:t>)</w:t>
-      </w:r>
-      <w:r>
-        <w:rPr>
-          <w:rFonts w:ascii="Arial" w:eastAsia="Times New Roman" w:hAnsi="Arial" w:cs="Arial"/>
-          <w:color w:val="000000"/>
-          <w:kern w:val="0"/>
-          <w14:ligatures w14:val="none"/>
-        </w:rPr>
-        <w:t xml:space="preserve"> and perfluoropentanoic acid (</w:t>
-      </w:r>
-      <w:proofErr w:type="spellStart"/>
-      <w:r>
-        <w:rPr>
-          <w:rFonts w:ascii="Arial" w:eastAsia="Times New Roman" w:hAnsi="Arial" w:cs="Arial"/>
-          <w:color w:val="000000"/>
-          <w:kern w:val="0"/>
-          <w14:ligatures w14:val="none"/>
-        </w:rPr>
-        <w:t>PFPeA</w:t>
-      </w:r>
-      <w:proofErr w:type="spellEnd"/>
-      <w:r>
-        <w:rPr>
-          <w:rFonts w:ascii="Arial" w:eastAsia="Times New Roman" w:hAnsi="Arial" w:cs="Arial"/>
-          <w:color w:val="000000"/>
-          <w:kern w:val="0"/>
-          <w14:ligatures w14:val="none"/>
-        </w:rPr>
-        <w:t>)</w:t>
-      </w:r>
-      <w:r>
-        <w:rPr>
-          <w:rFonts w:ascii="Arial" w:eastAsia="Times New Roman" w:hAnsi="Arial" w:cs="Arial"/>
-          <w:color w:val="000000"/>
-          <w:kern w:val="0"/>
-          <w14:ligatures w14:val="none"/>
-        </w:rPr>
-        <w:t xml:space="preserve">, and an environmental stressor </w:t>
-      </w:r>
-      <w:r>
-        <w:rPr>
-          <w:rFonts w:ascii="Arial" w:eastAsia="Times New Roman" w:hAnsi="Arial" w:cs="Arial"/>
-          <w:color w:val="000000"/>
-          <w:kern w:val="0"/>
-          <w14:ligatures w14:val="none"/>
-        </w:rPr>
-        <w:t>(</w:t>
-      </w:r>
-      <w:r>
-        <w:rPr>
-          <w:rFonts w:ascii="Arial" w:eastAsia="Times New Roman" w:hAnsi="Arial" w:cs="Arial"/>
-          <w:color w:val="000000"/>
-          <w:kern w:val="0"/>
-          <w14:ligatures w14:val="none"/>
-        </w:rPr>
-        <w:t>sal</w:t>
-      </w:r>
-      <w:r>
-        <w:rPr>
-          <w:rFonts w:ascii="Arial" w:eastAsia="Times New Roman" w:hAnsi="Arial" w:cs="Arial"/>
-          <w:color w:val="000000"/>
-          <w:kern w:val="0"/>
-          <w14:ligatures w14:val="none"/>
-        </w:rPr>
-        <w:t>inity increase)</w:t>
-      </w:r>
-      <w:r>
-        <w:rPr>
-          <w:rFonts w:ascii="Arial" w:eastAsia="Times New Roman" w:hAnsi="Arial" w:cs="Arial"/>
-          <w:color w:val="000000"/>
-          <w:kern w:val="0"/>
-          <w14:ligatures w14:val="none"/>
-        </w:rPr>
-        <w:t xml:space="preserve">. We anticipated that exposure to Cd or </w:t>
-      </w:r>
-      <w:proofErr w:type="spellStart"/>
-      <w:r>
-        <w:rPr>
-          <w:rFonts w:ascii="Arial" w:eastAsia="Times New Roman" w:hAnsi="Arial" w:cs="Arial"/>
-          <w:color w:val="000000"/>
-          <w:kern w:val="0"/>
-          <w14:ligatures w14:val="none"/>
-        </w:rPr>
-        <w:t>PFPeA</w:t>
-      </w:r>
-      <w:proofErr w:type="spellEnd"/>
-      <w:r>
-        <w:rPr>
-          <w:rFonts w:ascii="Arial" w:eastAsia="Times New Roman" w:hAnsi="Arial" w:cs="Arial"/>
-          <w:color w:val="000000"/>
-          <w:kern w:val="0"/>
-          <w14:ligatures w14:val="none"/>
-        </w:rPr>
-        <w:t xml:space="preserve">, indicated by the dashed "Treatment" line between blood samples 1 and 2, would </w:t>
-      </w:r>
-      <w:r>
-        <w:rPr>
-          <w:rFonts w:ascii="Arial" w:eastAsia="Times New Roman" w:hAnsi="Arial" w:cs="Arial"/>
-          <w:color w:val="000000"/>
-          <w:kern w:val="0"/>
-          <w14:ligatures w14:val="none"/>
-        </w:rPr>
-        <w:t>lead</w:t>
-      </w:r>
-      <w:r>
-        <w:rPr>
-          <w:rFonts w:ascii="Arial" w:eastAsia="Times New Roman" w:hAnsi="Arial" w:cs="Arial"/>
-          <w:color w:val="000000"/>
-          <w:kern w:val="0"/>
-          <w14:ligatures w14:val="none"/>
-        </w:rPr>
-        <w:t xml:space="preserve"> </w:t>
-      </w:r>
-      <w:r>
-        <w:rPr>
-          <w:rFonts w:ascii="Arial" w:eastAsia="Times New Roman" w:hAnsi="Arial" w:cs="Arial"/>
-          <w:color w:val="000000"/>
-          <w:kern w:val="0"/>
-          <w14:ligatures w14:val="none"/>
-        </w:rPr>
-        <w:t>to</w:t>
-      </w:r>
-      <w:r>
-        <w:rPr>
-          <w:rFonts w:ascii="Arial" w:eastAsia="Times New Roman" w:hAnsi="Arial" w:cs="Arial"/>
-          <w:color w:val="000000"/>
-          <w:kern w:val="0"/>
-          <w14:ligatures w14:val="none"/>
-        </w:rPr>
-        <w:t xml:space="preserve"> elevated NLR values, particularly in groups receiving higher doses of each toxin. </w:t>
-      </w:r>
-      <w:r>
-        <w:rPr>
-          <w:rFonts w:ascii="Arial" w:eastAsia="Times New Roman" w:hAnsi="Arial" w:cs="Arial"/>
-          <w:color w:val="000000"/>
-          <w:kern w:val="0"/>
-          <w14:ligatures w14:val="none"/>
-        </w:rPr>
-        <w:t>Furthermore</w:t>
-      </w:r>
-      <w:r>
-        <w:rPr>
-          <w:rFonts w:ascii="Arial" w:eastAsia="Times New Roman" w:hAnsi="Arial" w:cs="Arial"/>
-          <w:color w:val="000000"/>
-          <w:kern w:val="0"/>
-          <w14:ligatures w14:val="none"/>
-        </w:rPr>
-        <w:t xml:space="preserve">, we expected the </w:t>
-      </w:r>
-      <w:r>
-        <w:rPr>
-          <w:rFonts w:ascii="Arial" w:eastAsia="Times New Roman" w:hAnsi="Arial" w:cs="Arial"/>
-          <w:color w:val="000000"/>
-          <w:kern w:val="0"/>
-          <w14:ligatures w14:val="none"/>
-        </w:rPr>
-        <w:t>NLR</w:t>
-      </w:r>
-      <w:r>
-        <w:rPr>
-          <w:rFonts w:ascii="Arial" w:eastAsia="Times New Roman" w:hAnsi="Arial" w:cs="Arial"/>
-          <w:color w:val="000000"/>
-          <w:kern w:val="0"/>
-          <w14:ligatures w14:val="none"/>
-        </w:rPr>
-        <w:t xml:space="preserve"> to</w:t>
-      </w:r>
-      <w:r>
-        <w:rPr>
-          <w:rFonts w:ascii="Arial" w:eastAsia="Times New Roman" w:hAnsi="Arial" w:cs="Arial"/>
-          <w:color w:val="000000"/>
-          <w:kern w:val="0"/>
-          <w14:ligatures w14:val="none"/>
-        </w:rPr>
-        <w:t xml:space="preserve"> </w:t>
-      </w:r>
-      <w:r>
-        <w:rPr>
-          <w:rFonts w:ascii="Arial" w:eastAsia="Times New Roman" w:hAnsi="Arial" w:cs="Arial"/>
-          <w:color w:val="000000"/>
-          <w:kern w:val="0"/>
-          <w14:ligatures w14:val="none"/>
-        </w:rPr>
-        <w:t>increase</w:t>
-      </w:r>
-      <w:r>
-        <w:rPr>
-          <w:rFonts w:ascii="Arial" w:eastAsia="Times New Roman" w:hAnsi="Arial" w:cs="Arial"/>
-          <w:color w:val="000000"/>
-          <w:kern w:val="0"/>
-          <w14:ligatures w14:val="none"/>
-        </w:rPr>
-        <w:t xml:space="preserve"> </w:t>
-      </w:r>
-      <w:r>
-        <w:rPr>
-          <w:rFonts w:ascii="Arial" w:eastAsia="Times New Roman" w:hAnsi="Arial" w:cs="Arial"/>
-          <w:color w:val="000000"/>
-          <w:kern w:val="0"/>
-          <w14:ligatures w14:val="none"/>
-        </w:rPr>
-        <w:t>continuously in</w:t>
-      </w:r>
-      <w:r>
-        <w:rPr>
-          <w:rFonts w:ascii="Arial" w:eastAsia="Times New Roman" w:hAnsi="Arial" w:cs="Arial"/>
-          <w:color w:val="000000"/>
-          <w:kern w:val="0"/>
-          <w14:ligatures w14:val="none"/>
-        </w:rPr>
-        <w:t xml:space="preserve"> all fish after </w:t>
-      </w:r>
-      <w:r>
-        <w:rPr>
-          <w:rFonts w:ascii="Arial" w:eastAsia="Times New Roman" w:hAnsi="Arial" w:cs="Arial"/>
-          <w:color w:val="000000"/>
-          <w:kern w:val="0"/>
-          <w14:ligatures w14:val="none"/>
-        </w:rPr>
-        <w:t xml:space="preserve">exposure to an abruptly introduced environmental stressor, </w:t>
-      </w:r>
-      <w:r>
-        <w:rPr>
-          <w:rFonts w:ascii="Arial" w:eastAsia="Times New Roman" w:hAnsi="Arial" w:cs="Arial"/>
-          <w:color w:val="000000"/>
-          <w:kern w:val="0"/>
-          <w14:ligatures w14:val="none"/>
-        </w:rPr>
-        <w:t xml:space="preserve">as </w:t>
-      </w:r>
-      <w:r>
-        <w:rPr>
-          <w:rFonts w:ascii="Arial" w:eastAsia="Times New Roman" w:hAnsi="Arial" w:cs="Arial"/>
-          <w:color w:val="000000"/>
-          <w:kern w:val="0"/>
-          <w14:ligatures w14:val="none"/>
-        </w:rPr>
-        <w:t>represented by the dashed "Salt" line between blood samples 2 and 3.</w:t>
       </w:r>
     </w:p>
     <w:p>
@@ -36448,423 +36135,6 @@
         </w:rPr>
         <w:t xml:space="preserve"> </w:t>
       </w:r>
-      <w:r>
-        <w:rPr>
-          <w:rFonts w:ascii="Arial" w:eastAsia="Times New Roman" w:hAnsi="Arial" w:cs="Arial"/>
-          <w:color w:val="000000"/>
-          <w:kern w:val="0"/>
-          <w14:ligatures w14:val="none"/>
-        </w:rPr>
-        <w:t>Overview of s</w:t>
-      </w:r>
-      <w:r>
-        <w:rPr>
-          <w:rFonts w:ascii="Arial" w:eastAsia="Times New Roman" w:hAnsi="Arial" w:cs="Arial"/>
-          <w:color w:val="000000"/>
-          <w:kern w:val="0"/>
-          <w14:ligatures w14:val="none"/>
-        </w:rPr>
-        <w:t xml:space="preserve">tudy design and experimental timeline. We </w:t>
-      </w:r>
-      <w:r>
-        <w:rPr>
-          <w:rFonts w:ascii="Arial" w:eastAsia="Times New Roman" w:hAnsi="Arial" w:cs="Arial"/>
-          <w:color w:val="000000"/>
-          <w:kern w:val="0"/>
-          <w14:ligatures w14:val="none"/>
-        </w:rPr>
-        <w:t>arrang</w:t>
-      </w:r>
-      <w:r>
-        <w:rPr>
-          <w:rFonts w:ascii="Arial" w:eastAsia="Times New Roman" w:hAnsi="Arial" w:cs="Arial"/>
-          <w:color w:val="000000"/>
-          <w:kern w:val="0"/>
-          <w14:ligatures w14:val="none"/>
-        </w:rPr>
-        <w:t>ed 15</w:t>
-      </w:r>
-      <w:r>
-        <w:rPr>
-          <w:rFonts w:ascii="Arial" w:eastAsia="Times New Roman" w:hAnsi="Arial" w:cs="Arial"/>
-          <w:color w:val="000000"/>
-          <w:kern w:val="0"/>
-          <w14:ligatures w14:val="none"/>
-        </w:rPr>
-        <w:t xml:space="preserve"> largemouth bass in individual </w:t>
-      </w:r>
-      <w:r>
-        <w:rPr>
-          <w:rFonts w:ascii="Arial" w:eastAsia="Times New Roman" w:hAnsi="Arial" w:cs="Arial"/>
-          <w:color w:val="000000"/>
-          <w:kern w:val="0"/>
-          <w14:ligatures w14:val="none"/>
-        </w:rPr>
-        <w:t xml:space="preserve">37.9 L rectangular tanks in three rows, </w:t>
-      </w:r>
-      <w:r>
-        <w:rPr>
-          <w:rFonts w:ascii="Arial" w:eastAsia="Times New Roman" w:hAnsi="Arial" w:cs="Arial"/>
-          <w:color w:val="000000"/>
-          <w:kern w:val="0"/>
-          <w14:ligatures w14:val="none"/>
-        </w:rPr>
-        <w:t>with</w:t>
-      </w:r>
-      <w:r>
-        <w:rPr>
-          <w:rFonts w:ascii="Arial" w:eastAsia="Times New Roman" w:hAnsi="Arial" w:cs="Arial"/>
-          <w:color w:val="000000"/>
-          <w:kern w:val="0"/>
-          <w14:ligatures w14:val="none"/>
-        </w:rPr>
-        <w:t xml:space="preserve"> opaque boundaries </w:t>
-      </w:r>
-      <w:r>
-        <w:rPr>
-          <w:rFonts w:ascii="Arial" w:eastAsia="Times New Roman" w:hAnsi="Arial" w:cs="Arial"/>
-          <w:color w:val="000000"/>
-          <w:kern w:val="0"/>
-          <w14:ligatures w14:val="none"/>
-        </w:rPr>
-        <w:t>along</w:t>
-      </w:r>
-      <w:r>
-        <w:rPr>
-          <w:rFonts w:ascii="Arial" w:eastAsia="Times New Roman" w:hAnsi="Arial" w:cs="Arial"/>
-          <w:color w:val="000000"/>
-          <w:kern w:val="0"/>
-          <w14:ligatures w14:val="none"/>
-        </w:rPr>
-        <w:t xml:space="preserve"> the </w:t>
-      </w:r>
-      <w:r>
-        <w:rPr>
-          <w:rFonts w:ascii="Arial" w:eastAsia="Times New Roman" w:hAnsi="Arial" w:cs="Arial"/>
-          <w:color w:val="000000"/>
-          <w:kern w:val="0"/>
-          <w14:ligatures w14:val="none"/>
-        </w:rPr>
-        <w:t>long</w:t>
-      </w:r>
-      <w:r>
-        <w:rPr>
-          <w:rFonts w:ascii="Arial" w:eastAsia="Times New Roman" w:hAnsi="Arial" w:cs="Arial"/>
-          <w:color w:val="000000"/>
-          <w:kern w:val="0"/>
-          <w14:ligatures w14:val="none"/>
-        </w:rPr>
-        <w:t xml:space="preserve"> sides (</w:t>
-      </w:r>
-      <w:r>
-        <w:rPr>
-          <w:rFonts w:ascii="Arial" w:eastAsia="Times New Roman" w:hAnsi="Arial" w:cs="Arial"/>
-          <w:color w:val="000000"/>
-          <w:kern w:val="0"/>
-          <w14:ligatures w14:val="none"/>
-        </w:rPr>
-        <w:t>indica</w:t>
-      </w:r>
-      <w:r>
-        <w:rPr>
-          <w:rFonts w:ascii="Arial" w:eastAsia="Times New Roman" w:hAnsi="Arial" w:cs="Arial"/>
-          <w:color w:val="000000"/>
-          <w:kern w:val="0"/>
-          <w14:ligatures w14:val="none"/>
-        </w:rPr>
-        <w:t>ted by thick solid black bars) and a mesh top (</w:t>
-      </w:r>
-      <w:r>
-        <w:rPr>
-          <w:rFonts w:ascii="Arial" w:eastAsia="Times New Roman" w:hAnsi="Arial" w:cs="Arial"/>
-          <w:color w:val="000000"/>
-          <w:kern w:val="0"/>
-          <w14:ligatures w14:val="none"/>
-        </w:rPr>
-        <w:t>indicated</w:t>
-      </w:r>
-      <w:r>
-        <w:rPr>
-          <w:rFonts w:ascii="Arial" w:eastAsia="Times New Roman" w:hAnsi="Arial" w:cs="Arial"/>
-          <w:color w:val="000000"/>
-          <w:kern w:val="0"/>
-          <w14:ligatures w14:val="none"/>
-        </w:rPr>
-        <w:t xml:space="preserve"> by dashed gray bars). Each tank </w:t>
-      </w:r>
-      <w:r>
-        <w:rPr>
-          <w:rFonts w:ascii="Arial" w:eastAsia="Times New Roman" w:hAnsi="Arial" w:cs="Arial"/>
-          <w:color w:val="000000"/>
-          <w:kern w:val="0"/>
-          <w14:ligatures w14:val="none"/>
-        </w:rPr>
-        <w:t>contain</w:t>
-      </w:r>
-      <w:r>
-        <w:rPr>
-          <w:rFonts w:ascii="Arial" w:eastAsia="Times New Roman" w:hAnsi="Arial" w:cs="Arial"/>
-          <w:color w:val="000000"/>
-          <w:kern w:val="0"/>
-          <w14:ligatures w14:val="none"/>
-        </w:rPr>
-        <w:t>ed 37.6 L of conditioned tap water (light blue)</w:t>
-      </w:r>
-      <w:r>
-        <w:rPr>
-          <w:rFonts w:ascii="Arial" w:eastAsia="Times New Roman" w:hAnsi="Arial" w:cs="Arial"/>
-          <w:color w:val="000000"/>
-          <w:kern w:val="0"/>
-          <w14:ligatures w14:val="none"/>
-        </w:rPr>
-        <w:t xml:space="preserve"> and was</w:t>
-      </w:r>
-      <w:r>
-        <w:rPr>
-          <w:rFonts w:ascii="Arial" w:eastAsia="Times New Roman" w:hAnsi="Arial" w:cs="Arial"/>
-          <w:color w:val="000000"/>
-          <w:kern w:val="0"/>
-          <w14:ligatures w14:val="none"/>
-        </w:rPr>
-        <w:t xml:space="preserve"> equipped</w:t>
-      </w:r>
-      <w:r>
-        <w:rPr>
-          <w:rFonts w:ascii="Arial" w:eastAsia="Times New Roman" w:hAnsi="Arial" w:cs="Arial"/>
-          <w:color w:val="000000"/>
-          <w:kern w:val="0"/>
-          <w14:ligatures w14:val="none"/>
-        </w:rPr>
-        <w:t xml:space="preserve"> with a</w:t>
-      </w:r>
-      <w:r>
-        <w:rPr>
-          <w:rFonts w:ascii="Arial" w:eastAsia="Times New Roman" w:hAnsi="Arial" w:cs="Arial"/>
-          <w:color w:val="000000"/>
-          <w:kern w:val="0"/>
-          <w14:ligatures w14:val="none"/>
-        </w:rPr>
-        <w:t>n aerator</w:t>
-      </w:r>
-      <w:r>
-        <w:rPr>
-          <w:rFonts w:ascii="Arial" w:eastAsia="Times New Roman" w:hAnsi="Arial" w:cs="Arial"/>
-          <w:color w:val="000000"/>
-          <w:kern w:val="0"/>
-          <w14:ligatures w14:val="none"/>
-        </w:rPr>
-        <w:t xml:space="preserve"> (yellow bubbler). We randomized the treatment order </w:t>
-      </w:r>
-      <w:r>
-        <w:rPr>
-          <w:rFonts w:ascii="Arial" w:eastAsia="Times New Roman" w:hAnsi="Arial" w:cs="Arial"/>
-          <w:color w:val="000000"/>
-          <w:kern w:val="0"/>
-          <w14:ligatures w14:val="none"/>
-        </w:rPr>
-        <w:t>across the tanks (five groups</w:t>
-      </w:r>
-      <w:r>
-        <w:rPr>
-          <w:rFonts w:ascii="Arial" w:eastAsia="Times New Roman" w:hAnsi="Arial" w:cs="Arial"/>
-          <w:color w:val="000000"/>
-          <w:kern w:val="0"/>
-          <w14:ligatures w14:val="none"/>
-        </w:rPr>
-        <w:t>—</w:t>
-      </w:r>
-      <w:r>
-        <w:rPr>
-          <w:rFonts w:ascii="Arial" w:eastAsia="Times New Roman" w:hAnsi="Arial" w:cs="Arial"/>
-          <w:color w:val="000000"/>
-          <w:kern w:val="0"/>
-          <w14:ligatures w14:val="none"/>
-        </w:rPr>
-        <w:t xml:space="preserve">control, </w:t>
-      </w:r>
-      <w:r>
-        <w:rPr>
-          <w:rFonts w:ascii="Arial" w:eastAsia="Times New Roman" w:hAnsi="Arial" w:cs="Arial"/>
-          <w:color w:val="000000"/>
-          <w:kern w:val="0"/>
-          <w14:ligatures w14:val="none"/>
-        </w:rPr>
-        <w:t>cadmium [Cd]</w:t>
-      </w:r>
-      <w:r>
-        <w:rPr>
-          <w:rFonts w:ascii="Arial" w:eastAsia="Times New Roman" w:hAnsi="Arial" w:cs="Arial"/>
-          <w:color w:val="000000"/>
-          <w:kern w:val="0"/>
-          <w14:ligatures w14:val="none"/>
-        </w:rPr>
-        <w:t xml:space="preserve"> low </w:t>
-      </w:r>
-      <w:r>
-        <w:rPr>
-          <w:rFonts w:ascii="Arial" w:eastAsia="Times New Roman" w:hAnsi="Arial" w:cs="Arial"/>
-          <w:color w:val="000000"/>
-          <w:kern w:val="0"/>
-          <w14:ligatures w14:val="none"/>
-        </w:rPr>
-        <w:t xml:space="preserve">(0.034 ppm), cadmium high (0.34 ppm), </w:t>
-      </w:r>
-      <w:r>
-        <w:rPr>
-          <w:rFonts w:ascii="Arial" w:eastAsia="Times New Roman" w:hAnsi="Arial" w:cs="Arial"/>
-          <w:color w:val="000000"/>
-          <w:kern w:val="0"/>
-          <w14:ligatures w14:val="none"/>
-        </w:rPr>
-        <w:t>perfluoropentanoic acid</w:t>
-      </w:r>
-      <w:r>
-        <w:rPr>
-          <w:rFonts w:ascii="Arial" w:eastAsia="Times New Roman" w:hAnsi="Arial" w:cs="Arial"/>
-          <w:color w:val="000000"/>
-          <w:kern w:val="0"/>
-          <w14:ligatures w14:val="none"/>
-        </w:rPr>
-        <w:t xml:space="preserve"> [</w:t>
-      </w:r>
-      <w:proofErr w:type="spellStart"/>
-      <w:r>
-        <w:rPr>
-          <w:rFonts w:ascii="Arial" w:eastAsia="Times New Roman" w:hAnsi="Arial" w:cs="Arial"/>
-          <w:color w:val="000000"/>
-          <w:kern w:val="0"/>
-          <w14:ligatures w14:val="none"/>
-        </w:rPr>
-        <w:t>PFPeA</w:t>
-      </w:r>
-      <w:proofErr w:type="spellEnd"/>
-      <w:r>
-        <w:rPr>
-          <w:rFonts w:ascii="Arial" w:eastAsia="Times New Roman" w:hAnsi="Arial" w:cs="Arial"/>
-          <w:color w:val="000000"/>
-          <w:kern w:val="0"/>
-          <w14:ligatures w14:val="none"/>
-        </w:rPr>
-        <w:t xml:space="preserve">] low (3.4 mg/L), </w:t>
-      </w:r>
-      <w:r>
-        <w:rPr>
-          <w:rFonts w:ascii="Arial" w:eastAsia="Times New Roman" w:hAnsi="Arial" w:cs="Arial"/>
-          <w:color w:val="000000"/>
-          <w:kern w:val="0"/>
-          <w14:ligatures w14:val="none"/>
-        </w:rPr>
-        <w:t>perfluoropentanoic acid</w:t>
-      </w:r>
-      <w:r>
-        <w:rPr>
-          <w:rFonts w:ascii="Arial" w:eastAsia="Times New Roman" w:hAnsi="Arial" w:cs="Arial"/>
-          <w:color w:val="000000"/>
-          <w:kern w:val="0"/>
-          <w14:ligatures w14:val="none"/>
-        </w:rPr>
-        <w:t xml:space="preserve"> high (34 mg/L)—</w:t>
-      </w:r>
-      <w:r>
-        <w:rPr>
-          <w:rFonts w:ascii="Arial" w:eastAsia="Times New Roman" w:hAnsi="Arial" w:cs="Arial"/>
-          <w:color w:val="000000"/>
-          <w:kern w:val="0"/>
-          <w14:ligatures w14:val="none"/>
-        </w:rPr>
-        <w:t>each represented by a different color).</w:t>
-      </w:r>
-      <w:r>
-        <w:rPr>
-          <w:rFonts w:ascii="Arial" w:eastAsia="Times New Roman" w:hAnsi="Arial" w:cs="Arial"/>
-          <w:color w:val="000000"/>
-          <w:kern w:val="0"/>
-          <w14:ligatures w14:val="none"/>
-        </w:rPr>
-        <w:t xml:space="preserve"> Below </w:t>
-      </w:r>
-      <w:r>
-        <w:rPr>
-          <w:rFonts w:ascii="Arial" w:eastAsia="Times New Roman" w:hAnsi="Arial" w:cs="Arial"/>
-          <w:color w:val="000000"/>
-          <w:kern w:val="0"/>
-          <w14:ligatures w14:val="none"/>
-        </w:rPr>
-        <w:lastRenderedPageBreak/>
-        <w:t>the tank design, connect</w:t>
-      </w:r>
-      <w:r>
-        <w:rPr>
-          <w:rFonts w:ascii="Arial" w:eastAsia="Times New Roman" w:hAnsi="Arial" w:cs="Arial"/>
-          <w:color w:val="000000"/>
-          <w:kern w:val="0"/>
-          <w14:ligatures w14:val="none"/>
-        </w:rPr>
-        <w:t>ed</w:t>
-      </w:r>
-      <w:r>
-        <w:rPr>
-          <w:rFonts w:ascii="Arial" w:eastAsia="Times New Roman" w:hAnsi="Arial" w:cs="Arial"/>
-          <w:color w:val="000000"/>
-          <w:kern w:val="0"/>
-          <w14:ligatures w14:val="none"/>
-        </w:rPr>
-        <w:t xml:space="preserve"> boxes </w:t>
-      </w:r>
-      <w:r>
-        <w:rPr>
-          <w:rFonts w:ascii="Arial" w:eastAsia="Times New Roman" w:hAnsi="Arial" w:cs="Arial"/>
-          <w:color w:val="000000"/>
-          <w:kern w:val="0"/>
-          <w14:ligatures w14:val="none"/>
-        </w:rPr>
-        <w:t>illustrate</w:t>
-      </w:r>
-      <w:r>
-        <w:rPr>
-          <w:rFonts w:ascii="Arial" w:eastAsia="Times New Roman" w:hAnsi="Arial" w:cs="Arial"/>
-          <w:color w:val="000000"/>
-          <w:kern w:val="0"/>
-          <w14:ligatures w14:val="none"/>
-        </w:rPr>
-        <w:t xml:space="preserve"> the chronological order of </w:t>
-      </w:r>
-      <w:r>
-        <w:rPr>
-          <w:rFonts w:ascii="Arial" w:eastAsia="Times New Roman" w:hAnsi="Arial" w:cs="Arial"/>
-          <w:color w:val="000000"/>
-          <w:kern w:val="0"/>
-          <w14:ligatures w14:val="none"/>
-        </w:rPr>
-        <w:t>signific</w:t>
-      </w:r>
-      <w:r>
-        <w:rPr>
-          <w:rFonts w:ascii="Arial" w:eastAsia="Times New Roman" w:hAnsi="Arial" w:cs="Arial"/>
-          <w:color w:val="000000"/>
-          <w:kern w:val="0"/>
-          <w14:ligatures w14:val="none"/>
-        </w:rPr>
-        <w:t xml:space="preserve">ant daily events from the start (day 1) to the </w:t>
-      </w:r>
-      <w:r>
-        <w:rPr>
-          <w:rFonts w:ascii="Arial" w:eastAsia="Times New Roman" w:hAnsi="Arial" w:cs="Arial"/>
-          <w:color w:val="000000"/>
-          <w:kern w:val="0"/>
-          <w14:ligatures w14:val="none"/>
-        </w:rPr>
-        <w:t>end</w:t>
-      </w:r>
-      <w:r>
-        <w:rPr>
-          <w:rFonts w:ascii="Arial" w:eastAsia="Times New Roman" w:hAnsi="Arial" w:cs="Arial"/>
-          <w:color w:val="000000"/>
-          <w:kern w:val="0"/>
-          <w14:ligatures w14:val="none"/>
-        </w:rPr>
-        <w:t xml:space="preserve"> of the trial (day 22).</w:t>
-      </w:r>
     </w:p>
     <w:p>
       <w:pPr>
@@ -37077,240 +36347,7 @@
           <w:kern w:val="0"/>
           <w14:ligatures w14:val="none"/>
         </w:rPr>
-        <w:t>Figure 3. Individual tank water quality data (temperature, pH, dissolved oxygen, and salinity) collected from a YSI Pro DSS on each sampling day (Figure 2). Color denotes the treatment group</w:t>
-      </w:r>
-      <w:r>
-        <w:rPr>
-          <w:rFonts w:ascii="Arial" w:eastAsia="Times New Roman" w:hAnsi="Arial" w:cs="Arial"/>
-          <w:color w:val="000000"/>
-          <w:kern w:val="0"/>
-          <w14:ligatures w14:val="none"/>
-        </w:rPr>
-        <w:t xml:space="preserve"> </w:t>
-      </w:r>
-      <w:r>
-        <w:rPr>
-          <w:rFonts w:ascii="Arial" w:hAnsi="Arial" w:cs="Arial"/>
-        </w:rPr>
-        <w:t xml:space="preserve">(control and </w:t>
-      </w:r>
-      <w:r>
-        <w:rPr>
-          <w:rFonts w:ascii="Arial" w:eastAsia="Times New Roman" w:hAnsi="Arial" w:cs="Arial"/>
-          <w:color w:val="000000"/>
-          <w:kern w:val="0"/>
-          <w14:ligatures w14:val="none"/>
-        </w:rPr>
-        <w:t xml:space="preserve">low and high levels of </w:t>
-      </w:r>
-      <w:r>
-        <w:rPr>
-          <w:rFonts w:ascii="Arial" w:eastAsia="Times New Roman" w:hAnsi="Arial" w:cs="Arial"/>
-          <w:color w:val="000000"/>
-          <w:kern w:val="0"/>
-          <w14:ligatures w14:val="none"/>
-        </w:rPr>
-        <w:t>cadmium [</w:t>
-      </w:r>
-      <w:r>
-        <w:rPr>
-          <w:rFonts w:ascii="Arial" w:eastAsia="Times New Roman" w:hAnsi="Arial" w:cs="Arial"/>
-          <w:color w:val="000000"/>
-          <w:kern w:val="0"/>
-          <w14:ligatures w14:val="none"/>
-        </w:rPr>
-        <w:t>Cd</w:t>
-      </w:r>
-      <w:r>
-        <w:rPr>
-          <w:rFonts w:ascii="Arial" w:eastAsia="Times New Roman" w:hAnsi="Arial" w:cs="Arial"/>
-          <w:color w:val="000000"/>
-          <w:kern w:val="0"/>
-          <w14:ligatures w14:val="none"/>
-        </w:rPr>
-        <w:t>]</w:t>
-      </w:r>
-      <w:r>
-        <w:rPr>
-          <w:rFonts w:ascii="Arial" w:eastAsia="Times New Roman" w:hAnsi="Arial" w:cs="Arial"/>
-          <w:color w:val="000000"/>
-          <w:kern w:val="0"/>
-          <w14:ligatures w14:val="none"/>
-        </w:rPr>
-        <w:t xml:space="preserve"> and perfluoropentanoic acid </w:t>
-      </w:r>
-      <w:r>
-        <w:rPr>
-          <w:rFonts w:ascii="Arial" w:eastAsia="Times New Roman" w:hAnsi="Arial" w:cs="Arial"/>
-          <w:color w:val="000000"/>
-          <w:kern w:val="0"/>
-          <w14:ligatures w14:val="none"/>
-        </w:rPr>
-        <w:t>[</w:t>
-      </w:r>
-      <w:proofErr w:type="spellStart"/>
-      <w:r>
-        <w:rPr>
-          <w:rFonts w:ascii="Arial" w:eastAsia="Times New Roman" w:hAnsi="Arial" w:cs="Arial"/>
-          <w:color w:val="000000"/>
-          <w:kern w:val="0"/>
-          <w14:ligatures w14:val="none"/>
-        </w:rPr>
-        <w:t>PFPeA</w:t>
-      </w:r>
-      <w:proofErr w:type="spellEnd"/>
-      <w:r>
-        <w:rPr>
-          <w:rFonts w:ascii="Arial" w:eastAsia="Times New Roman" w:hAnsi="Arial" w:cs="Arial"/>
-          <w:color w:val="000000"/>
-          <w:kern w:val="0"/>
-          <w14:ligatures w14:val="none"/>
-        </w:rPr>
-        <w:t>])</w:t>
-      </w:r>
-      <w:r>
-        <w:rPr>
-          <w:rFonts w:ascii="Arial" w:eastAsia="Times New Roman" w:hAnsi="Arial" w:cs="Arial"/>
-          <w:color w:val="000000"/>
-          <w:kern w:val="0"/>
-          <w14:ligatures w14:val="none"/>
-        </w:rPr>
-        <w:t xml:space="preserve">. The first vertical dashed line </w:t>
-      </w:r>
-      <w:r>
-        <w:rPr>
-          <w:rFonts w:ascii="Arial" w:eastAsia="Times New Roman" w:hAnsi="Arial" w:cs="Arial"/>
-          <w:color w:val="000000"/>
-          <w:kern w:val="0"/>
-          <w14:ligatures w14:val="none"/>
-        </w:rPr>
-        <w:t>indicate</w:t>
-      </w:r>
-      <w:r>
-        <w:rPr>
-          <w:rFonts w:ascii="Arial" w:eastAsia="Times New Roman" w:hAnsi="Arial" w:cs="Arial"/>
-          <w:color w:val="000000"/>
-          <w:kern w:val="0"/>
-          <w14:ligatures w14:val="none"/>
-        </w:rPr>
-        <w:t xml:space="preserve">s the day we added treatments, </w:t>
-      </w:r>
-      <w:r>
-        <w:rPr>
-          <w:rFonts w:ascii="Arial" w:eastAsia="Times New Roman" w:hAnsi="Arial" w:cs="Arial"/>
-          <w:color w:val="000000"/>
-          <w:kern w:val="0"/>
-          <w14:ligatures w14:val="none"/>
-        </w:rPr>
-        <w:t>while</w:t>
-      </w:r>
-      <w:r>
-        <w:rPr>
-          <w:rFonts w:ascii="Arial" w:eastAsia="Times New Roman" w:hAnsi="Arial" w:cs="Arial"/>
-          <w:color w:val="000000"/>
-          <w:kern w:val="0"/>
-          <w14:ligatures w14:val="none"/>
-        </w:rPr>
-        <w:t xml:space="preserve"> the second </w:t>
-      </w:r>
-      <w:r>
-        <w:rPr>
-          <w:rFonts w:ascii="Arial" w:eastAsia="Times New Roman" w:hAnsi="Arial" w:cs="Arial"/>
-          <w:color w:val="000000"/>
-          <w:kern w:val="0"/>
-          <w14:ligatures w14:val="none"/>
-        </w:rPr>
-        <w:t>mark</w:t>
-      </w:r>
-      <w:r>
-        <w:rPr>
-          <w:rFonts w:ascii="Arial" w:eastAsia="Times New Roman" w:hAnsi="Arial" w:cs="Arial"/>
-          <w:color w:val="000000"/>
-          <w:kern w:val="0"/>
-          <w14:ligatures w14:val="none"/>
-        </w:rPr>
-        <w:t xml:space="preserve">s the day we added salt. Note that </w:t>
-      </w:r>
-      <w:r>
-        <w:rPr>
-          <w:rFonts w:ascii="Arial" w:eastAsia="Times New Roman" w:hAnsi="Arial" w:cs="Arial"/>
-          <w:color w:val="000000"/>
-          <w:kern w:val="0"/>
-          <w14:ligatures w14:val="none"/>
-        </w:rPr>
-        <w:t>the</w:t>
-      </w:r>
-      <w:r>
-        <w:rPr>
-          <w:rFonts w:ascii="Arial" w:eastAsia="Times New Roman" w:hAnsi="Arial" w:cs="Arial"/>
-          <w:color w:val="000000"/>
-          <w:kern w:val="0"/>
-          <w14:ligatures w14:val="none"/>
-        </w:rPr>
-        <w:t xml:space="preserve"> </w:t>
-      </w:r>
-      <w:r>
-        <w:rPr>
-          <w:rFonts w:ascii="Arial" w:eastAsia="Times New Roman" w:hAnsi="Arial" w:cs="Arial"/>
-          <w:color w:val="000000"/>
-          <w:kern w:val="0"/>
-          <w14:ligatures w14:val="none"/>
-        </w:rPr>
-        <w:t>reported</w:t>
-      </w:r>
-      <w:r>
-        <w:rPr>
-          <w:rFonts w:ascii="Arial" w:eastAsia="Times New Roman" w:hAnsi="Arial" w:cs="Arial"/>
-          <w:color w:val="000000"/>
-          <w:kern w:val="0"/>
-          <w14:ligatures w14:val="none"/>
-        </w:rPr>
-        <w:t xml:space="preserve"> </w:t>
-      </w:r>
-      <w:r>
-        <w:rPr>
-          <w:rFonts w:ascii="Arial" w:eastAsia="Times New Roman" w:hAnsi="Arial" w:cs="Arial"/>
-          <w:color w:val="000000"/>
-          <w:kern w:val="0"/>
-          <w14:ligatures w14:val="none"/>
-        </w:rPr>
-        <w:t>YSI data</w:t>
-      </w:r>
-      <w:r>
-        <w:rPr>
-          <w:rFonts w:ascii="Arial" w:eastAsia="Times New Roman" w:hAnsi="Arial" w:cs="Arial"/>
-          <w:color w:val="000000"/>
-          <w:kern w:val="0"/>
-          <w14:ligatures w14:val="none"/>
-        </w:rPr>
-        <w:t xml:space="preserve"> on day 15 are</w:t>
-      </w:r>
-      <w:r>
-        <w:rPr>
-          <w:rFonts w:ascii="Arial" w:eastAsia="Times New Roman" w:hAnsi="Arial" w:cs="Arial"/>
-          <w:color w:val="000000"/>
-          <w:kern w:val="0"/>
-          <w14:ligatures w14:val="none"/>
-        </w:rPr>
-        <w:t xml:space="preserve"> </w:t>
-      </w:r>
-      <w:r>
-        <w:rPr>
-          <w:rFonts w:ascii="Arial" w:eastAsia="Times New Roman" w:hAnsi="Arial" w:cs="Arial"/>
-          <w:color w:val="000000"/>
-          <w:kern w:val="0"/>
-          <w14:ligatures w14:val="none"/>
-        </w:rPr>
-        <w:t>before</w:t>
-      </w:r>
-      <w:r>
-        <w:rPr>
-          <w:rFonts w:ascii="Arial" w:eastAsia="Times New Roman" w:hAnsi="Arial" w:cs="Arial"/>
-          <w:color w:val="000000"/>
-          <w:kern w:val="0"/>
-          <w14:ligatures w14:val="none"/>
-        </w:rPr>
-        <w:t xml:space="preserve"> salt addition.</w:t>
+        <w:t xml:space="preserve">Figure 3. </w:t>
       </w:r>
     </w:p>
     <w:p>
@@ -37349,244 +36386,18 @@
         <w:rPr>
           <w:rFonts w:ascii="Arial" w:hAnsi="Arial" w:cs="Arial"/>
         </w:rPr>
-        <w:t xml:space="preserve">Figure 4. Largemouth bass </w:t>
-      </w:r>
-      <w:r>
-        <w:rPr>
-          <w:rFonts w:ascii="Arial" w:eastAsia="Times New Roman" w:hAnsi="Arial" w:cs="Arial"/>
-          <w:color w:val="000000"/>
-          <w:kern w:val="0"/>
-          <w14:ligatures w14:val="none"/>
-        </w:rPr>
-        <w:t xml:space="preserve">neutrophil-to-lymphocyte ratios (NLR) from blood smears throughout the study. The five colors represent individual groups: </w:t>
-      </w:r>
-      <w:r>
-        <w:rPr>
-          <w:rFonts w:ascii="Arial" w:eastAsia="Times New Roman" w:hAnsi="Arial" w:cs="Arial"/>
-          <w:color w:val="000000"/>
-          <w:kern w:val="0"/>
-          <w14:ligatures w14:val="none"/>
-        </w:rPr>
-        <w:t xml:space="preserve">low and high levels of </w:t>
-      </w:r>
-      <w:r>
-        <w:rPr>
-          <w:rFonts w:ascii="Arial" w:eastAsia="Times New Roman" w:hAnsi="Arial" w:cs="Arial"/>
-          <w:color w:val="000000"/>
-          <w:kern w:val="0"/>
-          <w14:ligatures w14:val="none"/>
-        </w:rPr>
-        <w:t>cadmium (</w:t>
-      </w:r>
-      <w:r>
-        <w:rPr>
-          <w:rFonts w:ascii="Arial" w:eastAsia="Times New Roman" w:hAnsi="Arial" w:cs="Arial"/>
-          <w:color w:val="000000"/>
-          <w:kern w:val="0"/>
-          <w14:ligatures w14:val="none"/>
-        </w:rPr>
-        <w:t>Cd</w:t>
-      </w:r>
-      <w:r>
-        <w:rPr>
-          <w:rFonts w:ascii="Arial" w:eastAsia="Times New Roman" w:hAnsi="Arial" w:cs="Arial"/>
-          <w:color w:val="000000"/>
-          <w:kern w:val="0"/>
-          <w14:ligatures w14:val="none"/>
-        </w:rPr>
-        <w:t>)</w:t>
-      </w:r>
-      <w:r>
-        <w:rPr>
-          <w:rFonts w:ascii="Arial" w:eastAsia="Times New Roman" w:hAnsi="Arial" w:cs="Arial"/>
-          <w:color w:val="000000"/>
-          <w:kern w:val="0"/>
-          <w14:ligatures w14:val="none"/>
-        </w:rPr>
-        <w:t xml:space="preserve"> and perfluoropentanoic acid (</w:t>
-      </w:r>
-      <w:proofErr w:type="spellStart"/>
-      <w:r>
-        <w:rPr>
-          <w:rFonts w:ascii="Arial" w:eastAsia="Times New Roman" w:hAnsi="Arial" w:cs="Arial"/>
-          <w:color w:val="000000"/>
-          <w:kern w:val="0"/>
-          <w14:ligatures w14:val="none"/>
-        </w:rPr>
-        <w:t>PFPeA</w:t>
-      </w:r>
-      <w:proofErr w:type="spellEnd"/>
-      <w:r>
-        <w:rPr>
-          <w:rFonts w:ascii="Arial" w:eastAsia="Times New Roman" w:hAnsi="Arial" w:cs="Arial"/>
-          <w:color w:val="000000"/>
-          <w:kern w:val="0"/>
-          <w14:ligatures w14:val="none"/>
-        </w:rPr>
-        <w:t>), and the control. Lines dictate the generalized linear mixed-effects model</w:t>
-      </w:r>
-      <w:r>
-        <w:rPr>
-          <w:rFonts w:ascii="Arial" w:eastAsia="Times New Roman" w:hAnsi="Arial" w:cs="Arial"/>
-          <w:color w:val="000000"/>
-          <w:kern w:val="0"/>
-          <w14:ligatures w14:val="none"/>
-        </w:rPr>
-        <w:t>-</w:t>
-      </w:r>
-      <w:r>
-        <w:rPr>
-          <w:rFonts w:ascii="Arial" w:eastAsia="Times New Roman" w:hAnsi="Arial" w:cs="Arial"/>
-          <w:color w:val="000000"/>
-          <w:kern w:val="0"/>
-          <w14:ligatures w14:val="none"/>
-        </w:rPr>
-        <w:t>estimated relationships among the groups and blood samples (slopes can vary due to the group</w:t>
-      </w:r>
-      <w:r>
-        <w:rPr>
-          <w:rFonts w:ascii="Arial" w:eastAsia="Times New Roman" w:hAnsi="Arial" w:cs="Arial"/>
-          <w:color w:val="000000"/>
-          <w:kern w:val="0"/>
-          <w14:ligatures w14:val="none"/>
-        </w:rPr>
-        <w:t>-by-</w:t>
-      </w:r>
-      <w:r>
-        <w:rPr>
-          <w:rFonts w:ascii="Arial" w:eastAsia="Times New Roman" w:hAnsi="Arial" w:cs="Arial"/>
-          <w:color w:val="000000"/>
-          <w:kern w:val="0"/>
-          <w14:ligatures w14:val="none"/>
-        </w:rPr>
-        <w:t>blood</w:t>
-      </w:r>
-      <w:r>
-        <w:rPr>
-          <w:rFonts w:ascii="Arial" w:eastAsia="Times New Roman" w:hAnsi="Arial" w:cs="Arial"/>
-          <w:color w:val="000000"/>
-          <w:kern w:val="0"/>
-          <w14:ligatures w14:val="none"/>
-        </w:rPr>
-        <w:t>-</w:t>
-      </w:r>
-      <w:r>
-        <w:rPr>
-          <w:rFonts w:ascii="Arial" w:eastAsia="Times New Roman" w:hAnsi="Arial" w:cs="Arial"/>
-          <w:color w:val="000000"/>
-          <w:kern w:val="0"/>
-          <w14:ligatures w14:val="none"/>
-        </w:rPr>
-        <w:t xml:space="preserve">sample interaction). Jittered </w:t>
-      </w:r>
-      <w:r>
-        <w:rPr>
-          <w:rFonts w:ascii="Arial" w:eastAsia="Times New Roman" w:hAnsi="Arial" w:cs="Arial"/>
-          <w:color w:val="000000"/>
-          <w:kern w:val="0"/>
-          <w14:ligatures w14:val="none"/>
-        </w:rPr>
-        <w:lastRenderedPageBreak/>
-        <w:t>points represent individual bass NLR at each blood sample</w:t>
-      </w:r>
-      <w:r>
-        <w:rPr>
-          <w:rFonts w:ascii="Arial" w:eastAsia="Times New Roman" w:hAnsi="Arial" w:cs="Arial"/>
-          <w:color w:val="000000"/>
-          <w:kern w:val="0"/>
-          <w14:ligatures w14:val="none"/>
-        </w:rPr>
-        <w:t xml:space="preserve">. </w:t>
-      </w:r>
-      <w:r>
-        <w:rPr>
-          <w:rFonts w:ascii="Arial" w:eastAsia="Times New Roman" w:hAnsi="Arial" w:cs="Arial"/>
-          <w:color w:val="000000"/>
-          <w:kern w:val="0"/>
-          <w14:ligatures w14:val="none"/>
-        </w:rPr>
-        <w:t>E</w:t>
-      </w:r>
-      <w:r>
-        <w:rPr>
-          <w:rFonts w:ascii="Arial" w:eastAsia="Times New Roman" w:hAnsi="Arial" w:cs="Arial"/>
-          <w:color w:val="000000"/>
-          <w:kern w:val="0"/>
-          <w14:ligatures w14:val="none"/>
-        </w:rPr>
-        <w:t xml:space="preserve">xposure to Cd or </w:t>
-      </w:r>
-      <w:proofErr w:type="spellStart"/>
-      <w:r>
-        <w:rPr>
-          <w:rFonts w:ascii="Arial" w:eastAsia="Times New Roman" w:hAnsi="Arial" w:cs="Arial"/>
-          <w:color w:val="000000"/>
-          <w:kern w:val="0"/>
-          <w14:ligatures w14:val="none"/>
-        </w:rPr>
-        <w:t>PFPeA</w:t>
-      </w:r>
-      <w:proofErr w:type="spellEnd"/>
-      <w:r>
-        <w:rPr>
-          <w:rFonts w:ascii="Arial" w:eastAsia="Times New Roman" w:hAnsi="Arial" w:cs="Arial"/>
-          <w:color w:val="000000"/>
-          <w:kern w:val="0"/>
-          <w14:ligatures w14:val="none"/>
-        </w:rPr>
-        <w:t xml:space="preserve"> is</w:t>
-      </w:r>
-      <w:r>
-        <w:rPr>
-          <w:rFonts w:ascii="Arial" w:eastAsia="Times New Roman" w:hAnsi="Arial" w:cs="Arial"/>
-          <w:color w:val="000000"/>
-          <w:kern w:val="0"/>
-          <w14:ligatures w14:val="none"/>
-        </w:rPr>
-        <w:t xml:space="preserve"> indicated by the dashed "Treatment" line between blood samples 1 and 2. </w:t>
-      </w:r>
-      <w:r>
-        <w:rPr>
-          <w:rFonts w:ascii="Arial" w:eastAsia="Times New Roman" w:hAnsi="Arial" w:cs="Arial"/>
-          <w:color w:val="000000"/>
-          <w:kern w:val="0"/>
-          <w14:ligatures w14:val="none"/>
-        </w:rPr>
-        <w:t>E</w:t>
-      </w:r>
-      <w:r>
-        <w:rPr>
-          <w:rFonts w:ascii="Arial" w:eastAsia="Times New Roman" w:hAnsi="Arial" w:cs="Arial"/>
-          <w:color w:val="000000"/>
-          <w:kern w:val="0"/>
-          <w14:ligatures w14:val="none"/>
-        </w:rPr>
-        <w:t>xposure to an environmental stressor</w:t>
-      </w:r>
-      <w:r>
-        <w:rPr>
-          <w:rFonts w:ascii="Arial" w:eastAsia="Times New Roman" w:hAnsi="Arial" w:cs="Arial"/>
-          <w:color w:val="000000"/>
-          <w:kern w:val="0"/>
-          <w14:ligatures w14:val="none"/>
-        </w:rPr>
-        <w:t xml:space="preserve"> is</w:t>
-      </w:r>
-      <w:r>
-        <w:rPr>
-          <w:rFonts w:ascii="Arial" w:eastAsia="Times New Roman" w:hAnsi="Arial" w:cs="Arial"/>
-          <w:color w:val="000000"/>
-          <w:kern w:val="0"/>
-          <w14:ligatures w14:val="none"/>
-        </w:rPr>
-        <w:t xml:space="preserve"> represented by the dashed "Salt" line between blood samples 2 and 3.</w:t>
+        <w:t xml:space="preserve">Figure 4. </w:t>
       </w:r>
     </w:p>
     <w:p>
       <w:pPr>
         <w:spacing w:line="480" w:lineRule="auto"/>
         <w:rPr>
-          <w:rFonts w:ascii="Arial" w:hAnsi="Arial" w:cs="Arial"/>
+          <w:rFonts w:ascii="Arial" w:eastAsia="Times New Roman" w:hAnsi="Arial" w:cs="Arial"/>
+          <w:color w:val="000000"/>
+          <w:kern w:val="0"/>
+          <w:bdr w:val="none" w:sz="0" w:space="0" w:color="auto" w:frame="1"/>
+          <w14:ligatures w14:val="none"/>
         </w:rPr>
       </w:pPr>
       <w:r>
@@ -37605,632 +36416,20 @@
         <w:rPr>
           <w:rFonts w:ascii="Arial" w:hAnsi="Arial" w:cs="Arial"/>
         </w:rPr>
-        <w:t xml:space="preserve"> blood samples. Ratios rise after high perfluoropentanoic acid exposure and remain elevated after salinity increases. Other groups show temporary increases following salinity exposure, followed by declines at the final sample</w:t>
+        <w:t xml:space="preserve"> blood samples. Ratios rise after high perfluoropentanoic acid exposure and remain elevated after salinity increases. Other groups show </w:t>
+      </w:r>
+      <w:r>
+        <w:rPr>
+          <w:rFonts w:ascii="Arial" w:hAnsi="Arial" w:cs="Arial"/>
+        </w:rPr>
+        <w:lastRenderedPageBreak/>
+        <w:t>temporary increases following salinity exposure, followed by declines at the final sample</w:t>
       </w:r>
       <w:r>
         <w:rPr>
           <w:rFonts w:ascii="Arial" w:hAnsi="Arial" w:cs="Arial"/>
         </w:rPr>
         <w:t>.</w:t>
-      </w:r>
-    </w:p>
-    <w:p>
-      <w:pPr>
-        <w:rPr>
-          <w:rFonts w:ascii="Arial" w:hAnsi="Arial" w:cs="Arial"/>
-        </w:rPr>
-      </w:pPr>
-      <w:r>
-        <w:rPr>
-          <w:rFonts w:ascii="Arial" w:hAnsi="Arial" w:cs="Arial"/>
-        </w:rPr>
-        <w:br w:type="page"/>
-      </w:r>
-    </w:p>
-    <w:p>
-      <w:pPr>
-        <w:spacing w:line="480" w:lineRule="auto"/>
-        <w:rPr>
-          <w:rFonts w:ascii="Arial" w:hAnsi="Arial" w:cs="Arial"/>
-        </w:rPr>
-      </w:pPr>
-      <w:r>
-        <w:rPr>
-          <w:rFonts w:ascii="Arial" w:hAnsi="Arial" w:cs="Arial"/>
-          <w:b/>
-          <w:bCs/>
-        </w:rPr>
-        <w:lastRenderedPageBreak/>
-        <w:t>1</w:t>
-      </w:r>
-      <w:r>
-        <w:rPr>
-          <w:rFonts w:ascii="Arial" w:hAnsi="Arial" w:cs="Arial"/>
-          <w:b/>
-          <w:bCs/>
-        </w:rPr>
-        <w:t>4</w:t>
-      </w:r>
-      <w:r>
-        <w:rPr>
-          <w:rFonts w:ascii="Arial" w:hAnsi="Arial" w:cs="Arial"/>
-          <w:b/>
-          <w:bCs/>
-        </w:rPr>
-        <w:t>. Figures</w:t>
-      </w:r>
-    </w:p>
-    <w:p>
-      <w:pPr>
-        <w:spacing w:line="480" w:lineRule="auto"/>
-        <w:rPr>
-          <w:rFonts w:ascii="Arial" w:hAnsi="Arial" w:cs="Arial"/>
-        </w:rPr>
-      </w:pPr>
-      <w:r>
-        <w:rPr>
-          <w:rFonts w:ascii="Arial" w:hAnsi="Arial" w:cs="Arial"/>
-        </w:rPr>
-        <w:t>Figure 1.</w:t>
-      </w:r>
-    </w:p>
-    <w:p>
-      <w:pPr>
-        <w:spacing w:line="480" w:lineRule="auto"/>
-        <w:jc w:val="center"/>
-        <w:rPr>
-          <w:rFonts w:ascii="Arial" w:eastAsia="Times New Roman" w:hAnsi="Arial" w:cs="Arial"/>
-          <w:color w:val="000000"/>
-          <w:kern w:val="0"/>
-          <w:bdr w:val="none" w:sz="0" w:space="0" w:color="auto" w:frame="1"/>
-          <w14:ligatures w14:val="none"/>
-        </w:rPr>
-      </w:pPr>
-      <w:r>
-        <w:rPr>
-          <w:rFonts w:ascii="Arial" w:eastAsia="Times New Roman" w:hAnsi="Arial" w:cs="Arial"/>
-          <w:color w:val="000000"/>
-          <w:kern w:val="0"/>
-          <w:bdr w:val="none" w:sz="0" w:space="0" w:color="auto" w:frame="1"/>
-          <w14:ligatures w14:val="none"/>
-        </w:rPr>
-        <w:fldChar w:fldCharType="begin"/>
-      </w:r>
-      <w:r>
-        <w:rPr>
-          <w:rFonts w:ascii="Arial" w:eastAsia="Times New Roman" w:hAnsi="Arial" w:cs="Arial"/>
-          <w:color w:val="000000"/>
-          <w:kern w:val="0"/>
-          <w:bdr w:val="none" w:sz="0" w:space="0" w:color="auto" w:frame="1"/>
-          <w14:ligatures w14:val="none"/>
-        </w:rPr>
-        <w:instrText xml:space="preserve"> INCLUDEPICTURE "https://lh7-rt.googleusercontent.com/docsz/AD_4nXc9GpeWsYIj1h4fcjMKdFsAI0nc_7xsLdd-YMRyMh212Rm5NngGXCOIE4pBczmTfSbUxkkpO6O0apPRKj92sGaSVqqX8Hi90ML5qW31IAVsacnJ15xN8ddidRi5MmN6TZCOvHLswcGR5xHbWaBH5PniwPDk?key=5FzoVyNrle-Ubg5_Vet7RA" \* MERGEFORMATINET </w:instrText>
-      </w:r>
-      <w:r>
-        <w:rPr>
-          <w:rFonts w:ascii="Arial" w:eastAsia="Times New Roman" w:hAnsi="Arial" w:cs="Arial"/>
-          <w:color w:val="000000"/>
-          <w:kern w:val="0"/>
-          <w:bdr w:val="none" w:sz="0" w:space="0" w:color="auto" w:frame="1"/>
-          <w14:ligatures w14:val="none"/>
-        </w:rPr>
-        <w:fldChar w:fldCharType="separate"/>
-      </w:r>
-      <w:r>
-        <w:rPr>
-          <w:rFonts w:ascii="Arial" w:eastAsia="Times New Roman" w:hAnsi="Arial" w:cs="Arial"/>
-          <w:noProof/>
-          <w:color w:val="000000"/>
-          <w:kern w:val="0"/>
-          <w:bdr w:val="none" w:sz="0" w:space="0" w:color="auto" w:frame="1"/>
-          <w14:ligatures w14:val="none"/>
-        </w:rPr>
-        <w:drawing>
-          <wp:inline distT="0" distB="0" distL="0" distR="0" wp14:anchorId="609CBCCA" wp14:editId="31D24C2D">
-            <wp:extent cx="4801718" cy="2804203"/>
-            <wp:effectExtent l="0" t="0" r="0" b="2540"/>
-            <wp:docPr id="1383544523" name="Picture 3"/>
-            <wp:cNvGraphicFramePr>
-              <a:graphicFrameLocks xmlns:a="http://schemas.openxmlformats.org/drawingml/2006/main" noChangeAspect="1"/>
-            </wp:cNvGraphicFramePr>
-            <a:graphic xmlns:a="http://schemas.openxmlformats.org/drawingml/2006/main">
-              <a:graphicData uri="http://schemas.openxmlformats.org/drawingml/2006/picture">
-                <pic:pic xmlns:pic="http://schemas.openxmlformats.org/drawingml/2006/picture">
-                  <pic:nvPicPr>
-                    <pic:cNvPr id="0" name="Picture 7"/>
-                    <pic:cNvPicPr>
-                      <a:picLocks noChangeAspect="1" noChangeArrowheads="1"/>
-                    </pic:cNvPicPr>
-                  </pic:nvPicPr>
-                  <pic:blipFill>
-                    <a:blip r:embed="rId10" cstate="print">
-                      <a:extLst>
-                        <a:ext uri="{28A0092B-C50C-407E-A947-70E740481C1C}">
-                          <a14:useLocalDpi xmlns:a14="http://schemas.microsoft.com/office/drawing/2010/main" val="0"/>
-                        </a:ext>
-                      </a:extLst>
-                    </a:blip>
-                    <a:srcRect/>
-                    <a:stretch>
-                      <a:fillRect/>
-                    </a:stretch>
-                  </pic:blipFill>
-                  <pic:spPr bwMode="auto">
-                    <a:xfrm>
-                      <a:off x="0" y="0"/>
-                      <a:ext cx="4866222" cy="2841874"/>
-                    </a:xfrm>
-                    <a:prstGeom prst="rect">
-                      <a:avLst/>
-                    </a:prstGeom>
-                    <a:noFill/>
-                    <a:ln>
-                      <a:noFill/>
-                    </a:ln>
-                  </pic:spPr>
-                </pic:pic>
-              </a:graphicData>
-            </a:graphic>
-          </wp:inline>
-        </w:drawing>
-      </w:r>
-      <w:r>
-        <w:rPr>
-          <w:rFonts w:ascii="Arial" w:eastAsia="Times New Roman" w:hAnsi="Arial" w:cs="Arial"/>
-          <w:color w:val="000000"/>
-          <w:kern w:val="0"/>
-          <w:bdr w:val="none" w:sz="0" w:space="0" w:color="auto" w:frame="1"/>
-          <w14:ligatures w14:val="none"/>
-        </w:rPr>
-        <w:fldChar w:fldCharType="end"/>
-      </w:r>
-    </w:p>
-    <w:p>
-      <w:pPr>
-        <w:spacing w:line="480" w:lineRule="auto"/>
-        <w:rPr>
-          <w:rFonts w:ascii="Arial" w:eastAsia="Times New Roman" w:hAnsi="Arial" w:cs="Arial"/>
-          <w:color w:val="000000"/>
-          <w:kern w:val="0"/>
-          <w:bdr w:val="none" w:sz="0" w:space="0" w:color="auto" w:frame="1"/>
-          <w14:ligatures w14:val="none"/>
-        </w:rPr>
-      </w:pPr>
-    </w:p>
-    <w:p>
-      <w:pPr>
-        <w:spacing w:line="480" w:lineRule="auto"/>
-        <w:rPr>
-          <w:rFonts w:ascii="Arial" w:eastAsia="Times New Roman" w:hAnsi="Arial" w:cs="Arial"/>
-          <w:color w:val="000000"/>
-          <w:kern w:val="0"/>
-          <w:bdr w:val="none" w:sz="0" w:space="0" w:color="auto" w:frame="1"/>
-          <w14:ligatures w14:val="none"/>
-        </w:rPr>
-      </w:pPr>
-      <w:r>
-        <w:rPr>
-          <w:rFonts w:ascii="Arial" w:eastAsia="Times New Roman" w:hAnsi="Arial" w:cs="Arial"/>
-          <w:color w:val="000000"/>
-          <w:kern w:val="0"/>
-          <w:bdr w:val="none" w:sz="0" w:space="0" w:color="auto" w:frame="1"/>
-          <w14:ligatures w14:val="none"/>
-        </w:rPr>
-        <w:t>Figure 2.</w:t>
-      </w:r>
-    </w:p>
-    <w:p>
-      <w:pPr>
-        <w:spacing w:line="480" w:lineRule="auto"/>
-        <w:jc w:val="center"/>
-        <w:rPr>
-          <w:rFonts w:ascii="Arial" w:eastAsia="Times New Roman" w:hAnsi="Arial" w:cs="Arial"/>
-          <w:color w:val="000000"/>
-          <w:kern w:val="0"/>
-          <w:bdr w:val="none" w:sz="0" w:space="0" w:color="auto" w:frame="1"/>
-          <w14:ligatures w14:val="none"/>
-        </w:rPr>
-      </w:pPr>
-      <w:r>
-        <w:rPr>
-          <w:rFonts w:ascii="Arial" w:eastAsia="Times New Roman" w:hAnsi="Arial" w:cs="Arial"/>
-          <w:color w:val="000000"/>
-          <w:kern w:val="0"/>
-          <w:bdr w:val="none" w:sz="0" w:space="0" w:color="auto" w:frame="1"/>
-          <w14:ligatures w14:val="none"/>
-        </w:rPr>
-        <w:fldChar w:fldCharType="begin"/>
-      </w:r>
-      <w:r>
-        <w:rPr>
-          <w:rFonts w:ascii="Arial" w:eastAsia="Times New Roman" w:hAnsi="Arial" w:cs="Arial"/>
-          <w:color w:val="000000"/>
-          <w:kern w:val="0"/>
-          <w:bdr w:val="none" w:sz="0" w:space="0" w:color="auto" w:frame="1"/>
-          <w14:ligatures w14:val="none"/>
-        </w:rPr>
-        <w:instrText xml:space="preserve"> INCLUDEPICTURE "https://lh7-rt.googleusercontent.com/docsz/AD_4nXcJYadCg6eACHmkj3_lcX5C3kNP-Zmi4ZVoYtMg_nNE2aOkx6JaMsb7f2ozUKAt49s9LDKaoOdBFppB1PKLlNEWWBuEB8TrZQnddJDTOXiUWPsoDhwGHiU8dl2uR1aodRre1aTsSHn2M9t-Z88hvGUuLsc6?key=5FzoVyNrle-Ubg5_Vet7RA" \* MERGEFORMATINET </w:instrText>
-      </w:r>
-      <w:r>
-        <w:rPr>
-          <w:rFonts w:ascii="Arial" w:eastAsia="Times New Roman" w:hAnsi="Arial" w:cs="Arial"/>
-          <w:color w:val="000000"/>
-          <w:kern w:val="0"/>
-          <w:bdr w:val="none" w:sz="0" w:space="0" w:color="auto" w:frame="1"/>
-          <w14:ligatures w14:val="none"/>
-        </w:rPr>
-        <w:fldChar w:fldCharType="separate"/>
-      </w:r>
-      <w:r>
-        <w:rPr>
-          <w:rFonts w:ascii="Arial" w:eastAsia="Times New Roman" w:hAnsi="Arial" w:cs="Arial"/>
-          <w:noProof/>
-          <w:color w:val="000000"/>
-          <w:kern w:val="0"/>
-          <w:bdr w:val="none" w:sz="0" w:space="0" w:color="auto" w:frame="1"/>
-          <w14:ligatures w14:val="none"/>
-        </w:rPr>
-        <w:drawing>
-          <wp:inline distT="0" distB="0" distL="0" distR="0" wp14:anchorId="7FB2092A" wp14:editId="3F89E3DD">
-            <wp:extent cx="5032837" cy="3784694"/>
-            <wp:effectExtent l="0" t="0" r="0" b="0"/>
-            <wp:docPr id="8" name="Picture 2"/>
-            <wp:cNvGraphicFramePr>
-              <a:graphicFrameLocks xmlns:a="http://schemas.openxmlformats.org/drawingml/2006/main" noChangeAspect="1"/>
-            </wp:cNvGraphicFramePr>
-            <a:graphic xmlns:a="http://schemas.openxmlformats.org/drawingml/2006/main">
-              <a:graphicData uri="http://schemas.openxmlformats.org/drawingml/2006/picture">
-                <pic:pic xmlns:pic="http://schemas.openxmlformats.org/drawingml/2006/picture">
-                  <pic:nvPicPr>
-                    <pic:cNvPr id="0" name="Picture 8"/>
-                    <pic:cNvPicPr>
-                      <a:picLocks noChangeAspect="1" noChangeArrowheads="1"/>
-                    </pic:cNvPicPr>
-                  </pic:nvPicPr>
-                  <pic:blipFill>
-                    <a:blip r:embed="rId11" cstate="print">
-                      <a:extLst>
-                        <a:ext uri="{28A0092B-C50C-407E-A947-70E740481C1C}">
-                          <a14:useLocalDpi xmlns:a14="http://schemas.microsoft.com/office/drawing/2010/main" val="0"/>
-                        </a:ext>
-                      </a:extLst>
-                    </a:blip>
-                    <a:srcRect/>
-                    <a:stretch>
-                      <a:fillRect/>
-                    </a:stretch>
-                  </pic:blipFill>
-                  <pic:spPr bwMode="auto">
-                    <a:xfrm>
-                      <a:off x="0" y="0"/>
-                      <a:ext cx="5074181" cy="3815785"/>
-                    </a:xfrm>
-                    <a:prstGeom prst="rect">
-                      <a:avLst/>
-                    </a:prstGeom>
-                    <a:noFill/>
-                    <a:ln>
-                      <a:noFill/>
-                    </a:ln>
-                  </pic:spPr>
-                </pic:pic>
-              </a:graphicData>
-            </a:graphic>
-          </wp:inline>
-        </w:drawing>
-      </w:r>
-      <w:r>
-        <w:rPr>
-          <w:rFonts w:ascii="Arial" w:eastAsia="Times New Roman" w:hAnsi="Arial" w:cs="Arial"/>
-          <w:color w:val="000000"/>
-          <w:kern w:val="0"/>
-          <w:bdr w:val="none" w:sz="0" w:space="0" w:color="auto" w:frame="1"/>
-          <w14:ligatures w14:val="none"/>
-        </w:rPr>
-        <w:fldChar w:fldCharType="end"/>
-      </w:r>
-    </w:p>
-    <w:p>
-      <w:pPr>
-        <w:spacing w:line="480" w:lineRule="auto"/>
-        <w:rPr>
-          <w:rFonts w:ascii="Arial" w:eastAsia="Times New Roman" w:hAnsi="Arial" w:cs="Arial"/>
-          <w:color w:val="000000"/>
-          <w:kern w:val="0"/>
-          <w:bdr w:val="none" w:sz="0" w:space="0" w:color="auto" w:frame="1"/>
-          <w14:ligatures w14:val="none"/>
-        </w:rPr>
-      </w:pPr>
-    </w:p>
-    <w:p>
-      <w:pPr>
-        <w:spacing w:line="480" w:lineRule="auto"/>
-        <w:rPr>
-          <w:rFonts w:ascii="Arial" w:eastAsia="Times New Roman" w:hAnsi="Arial" w:cs="Arial"/>
-          <w:color w:val="000000"/>
-          <w:kern w:val="0"/>
-          <w:bdr w:val="none" w:sz="0" w:space="0" w:color="auto" w:frame="1"/>
-          <w14:ligatures w14:val="none"/>
-        </w:rPr>
-      </w:pPr>
-      <w:r>
-        <w:rPr>
-          <w:rFonts w:ascii="Arial" w:eastAsia="Times New Roman" w:hAnsi="Arial" w:cs="Arial"/>
-          <w:color w:val="000000"/>
-          <w:kern w:val="0"/>
-          <w:bdr w:val="none" w:sz="0" w:space="0" w:color="auto" w:frame="1"/>
-          <w14:ligatures w14:val="none"/>
-        </w:rPr>
-        <w:t>Figure 3.</w:t>
-      </w:r>
-    </w:p>
-    <w:p>
-      <w:pPr>
-        <w:spacing w:line="480" w:lineRule="auto"/>
-        <w:jc w:val="center"/>
-        <w:rPr>
-          <w:rFonts w:ascii="Arial" w:eastAsia="Times New Roman" w:hAnsi="Arial" w:cs="Arial"/>
-          <w:color w:val="000000"/>
-          <w:kern w:val="0"/>
-          <w:bdr w:val="none" w:sz="0" w:space="0" w:color="auto" w:frame="1"/>
-          <w14:ligatures w14:val="none"/>
-        </w:rPr>
-      </w:pPr>
-      <w:r>
-        <w:rPr>
-          <w:rFonts w:ascii="Arial" w:eastAsia="Times New Roman" w:hAnsi="Arial" w:cs="Arial"/>
-          <w:color w:val="000000"/>
-          <w:kern w:val="0"/>
-          <w:bdr w:val="none" w:sz="0" w:space="0" w:color="auto" w:frame="1"/>
-          <w14:ligatures w14:val="none"/>
-        </w:rPr>
-        <w:fldChar w:fldCharType="begin"/>
-      </w:r>
-      <w:r>
-        <w:rPr>
-          <w:rFonts w:ascii="Arial" w:eastAsia="Times New Roman" w:hAnsi="Arial" w:cs="Arial"/>
-          <w:color w:val="000000"/>
-          <w:kern w:val="0"/>
-          <w:bdr w:val="none" w:sz="0" w:space="0" w:color="auto" w:frame="1"/>
-          <w14:ligatures w14:val="none"/>
-        </w:rPr>
-        <w:instrText xml:space="preserve"> INCLUDEPICTURE "https://lh7-rt.googleusercontent.com/docsz/AD_4nXeAS3QDhRsa2ovYTXx_kwNxWpGkaTPUHxoS8-UdxjNm-DEzziwuAj_oNgpBqgE_BH4M1Q28DtGxhsSKc4FdhzvsPCIQIkkwTiAVCmYzARtI40RcIMukFbh3yMImCL6a9l-lgrqY2xMQXhPH8l6TSYVzwcOm?key=5FzoVyNrle-Ubg5_Vet7RA" \* MERGEFORMATINET </w:instrText>
-      </w:r>
-      <w:r>
-        <w:rPr>
-          <w:rFonts w:ascii="Arial" w:eastAsia="Times New Roman" w:hAnsi="Arial" w:cs="Arial"/>
-          <w:color w:val="000000"/>
-          <w:kern w:val="0"/>
-          <w:bdr w:val="none" w:sz="0" w:space="0" w:color="auto" w:frame="1"/>
-          <w14:ligatures w14:val="none"/>
-        </w:rPr>
-        <w:fldChar w:fldCharType="separate"/>
-      </w:r>
-      <w:r>
-        <w:rPr>
-          <w:rFonts w:ascii="Arial" w:eastAsia="Times New Roman" w:hAnsi="Arial" w:cs="Arial"/>
-          <w:noProof/>
-          <w:color w:val="000000"/>
-          <w:kern w:val="0"/>
-          <w:bdr w:val="none" w:sz="0" w:space="0" w:color="auto" w:frame="1"/>
-          <w14:ligatures w14:val="none"/>
-        </w:rPr>
-        <w:drawing>
-          <wp:inline distT="0" distB="0" distL="0" distR="0" wp14:anchorId="60254402" wp14:editId="6433377D">
-            <wp:extent cx="5032984" cy="3351968"/>
-            <wp:effectExtent l="0" t="0" r="0" b="1270"/>
-            <wp:docPr id="9" name="Picture 1"/>
-            <wp:cNvGraphicFramePr>
-              <a:graphicFrameLocks xmlns:a="http://schemas.openxmlformats.org/drawingml/2006/main" noChangeAspect="1"/>
-            </wp:cNvGraphicFramePr>
-            <a:graphic xmlns:a="http://schemas.openxmlformats.org/drawingml/2006/main">
-              <a:graphicData uri="http://schemas.openxmlformats.org/drawingml/2006/picture">
-                <pic:pic xmlns:pic="http://schemas.openxmlformats.org/drawingml/2006/picture">
-                  <pic:nvPicPr>
-                    <pic:cNvPr id="0" name="Picture 9"/>
-                    <pic:cNvPicPr>
-                      <a:picLocks noChangeAspect="1" noChangeArrowheads="1"/>
-                    </pic:cNvPicPr>
-                  </pic:nvPicPr>
-                  <pic:blipFill>
-                    <a:blip r:embed="rId12" cstate="print">
-                      <a:extLst>
-                        <a:ext uri="{28A0092B-C50C-407E-A947-70E740481C1C}">
-                          <a14:useLocalDpi xmlns:a14="http://schemas.microsoft.com/office/drawing/2010/main" val="0"/>
-                        </a:ext>
-                      </a:extLst>
-                    </a:blip>
-                    <a:srcRect/>
-                    <a:stretch>
-                      <a:fillRect/>
-                    </a:stretch>
-                  </pic:blipFill>
-                  <pic:spPr bwMode="auto">
-                    <a:xfrm>
-                      <a:off x="0" y="0"/>
-                      <a:ext cx="5066802" cy="3374491"/>
-                    </a:xfrm>
-                    <a:prstGeom prst="rect">
-                      <a:avLst/>
-                    </a:prstGeom>
-                    <a:noFill/>
-                    <a:ln>
-                      <a:noFill/>
-                    </a:ln>
-                  </pic:spPr>
-                </pic:pic>
-              </a:graphicData>
-            </a:graphic>
-          </wp:inline>
-        </w:drawing>
-      </w:r>
-      <w:r>
-        <w:rPr>
-          <w:rFonts w:ascii="Arial" w:eastAsia="Times New Roman" w:hAnsi="Arial" w:cs="Arial"/>
-          <w:color w:val="000000"/>
-          <w:kern w:val="0"/>
-          <w:bdr w:val="none" w:sz="0" w:space="0" w:color="auto" w:frame="1"/>
-          <w14:ligatures w14:val="none"/>
-        </w:rPr>
-        <w:fldChar w:fldCharType="end"/>
-      </w:r>
-    </w:p>
-    <w:p>
-      <w:pPr>
-        <w:spacing w:line="480" w:lineRule="auto"/>
-        <w:rPr>
-          <w:rFonts w:ascii="Arial" w:eastAsia="Times New Roman" w:hAnsi="Arial" w:cs="Arial"/>
-          <w:color w:val="000000"/>
-          <w:kern w:val="0"/>
-          <w:bdr w:val="none" w:sz="0" w:space="0" w:color="auto" w:frame="1"/>
-          <w14:ligatures w14:val="none"/>
-        </w:rPr>
-      </w:pPr>
-    </w:p>
-    <w:p>
-      <w:pPr>
-        <w:rPr>
-          <w:rFonts w:ascii="Arial" w:eastAsia="Times New Roman" w:hAnsi="Arial" w:cs="Arial"/>
-          <w:color w:val="000000"/>
-          <w:kern w:val="0"/>
-          <w:bdr w:val="none" w:sz="0" w:space="0" w:color="auto" w:frame="1"/>
-          <w14:ligatures w14:val="none"/>
-        </w:rPr>
-      </w:pPr>
-      <w:r>
-        <w:rPr>
-          <w:rFonts w:ascii="Arial" w:eastAsia="Times New Roman" w:hAnsi="Arial" w:cs="Arial"/>
-          <w:color w:val="000000"/>
-          <w:kern w:val="0"/>
-          <w:bdr w:val="none" w:sz="0" w:space="0" w:color="auto" w:frame="1"/>
-          <w14:ligatures w14:val="none"/>
-        </w:rPr>
-        <w:br w:type="page"/>
-      </w:r>
-    </w:p>
-    <w:p>
-      <w:pPr>
-        <w:spacing w:line="480" w:lineRule="auto"/>
-        <w:rPr>
-          <w:rFonts w:ascii="Arial" w:eastAsia="Times New Roman" w:hAnsi="Arial" w:cs="Arial"/>
-          <w:color w:val="000000"/>
-          <w:kern w:val="0"/>
-          <w:bdr w:val="none" w:sz="0" w:space="0" w:color="auto" w:frame="1"/>
-          <w14:ligatures w14:val="none"/>
-        </w:rPr>
-      </w:pPr>
-      <w:r>
-        <w:rPr>
-          <w:rFonts w:ascii="Arial" w:eastAsia="Times New Roman" w:hAnsi="Arial" w:cs="Arial"/>
-          <w:color w:val="000000"/>
-          <w:kern w:val="0"/>
-          <w:bdr w:val="none" w:sz="0" w:space="0" w:color="auto" w:frame="1"/>
-          <w14:ligatures w14:val="none"/>
-        </w:rPr>
-        <w:lastRenderedPageBreak/>
-        <w:t>Figure 4.</w:t>
-      </w:r>
-    </w:p>
-    <w:p>
-      <w:pPr>
-        <w:spacing w:line="480" w:lineRule="auto"/>
-        <w:jc w:val="center"/>
-        <w:rPr>
-          <w:rFonts w:ascii="Arial" w:hAnsi="Arial" w:cs="Arial"/>
-        </w:rPr>
-      </w:pPr>
-      <w:r>
-        <w:rPr>
-          <w:b/>
-          <w:bCs/>
-          <w:color w:val="000000"/>
-          <w:bdr w:val="none" w:sz="0" w:space="0" w:color="auto" w:frame="1"/>
-        </w:rPr>
-        <w:fldChar w:fldCharType="begin"/>
-      </w:r>
-      <w:r>
-        <w:rPr>
-          <w:b/>
-          <w:bCs/>
-          <w:color w:val="000000"/>
-          <w:bdr w:val="none" w:sz="0" w:space="0" w:color="auto" w:frame="1"/>
-        </w:rPr>
-        <w:instrText xml:space="preserve"> INCLUDEPICTURE "https://lh7-rt.googleusercontent.com/docsz/AD_4nXcFLnybuzb0URk8jbDLeY2xJvtvZhJjs98H0vGFi384waNWYMtFvvH9w95e0oj3eQqkjIl-bTKwHNDitmZ9uNdhL-XLuN7ASJl6ggbk1q2VSC-eO3q4yPzbvX19CSzg86qORZJMz5pK-Tq-6f1t1jAeGKNu?key=5FzoVyNrle-Ubg5_Vet7RA" \* MERGEFORMATINET </w:instrText>
-      </w:r>
-      <w:r>
-        <w:rPr>
-          <w:b/>
-          <w:bCs/>
-          <w:color w:val="000000"/>
-          <w:bdr w:val="none" w:sz="0" w:space="0" w:color="auto" w:frame="1"/>
-        </w:rPr>
-        <w:fldChar w:fldCharType="separate"/>
-      </w:r>
-      <w:r>
-        <w:rPr>
-          <w:b/>
-          <w:bCs/>
-          <w:noProof/>
-          <w:color w:val="000000"/>
-          <w:bdr w:val="none" w:sz="0" w:space="0" w:color="auto" w:frame="1"/>
-        </w:rPr>
-        <w:drawing>
-          <wp:inline distT="0" distB="0" distL="0" distR="0" wp14:anchorId="74728256" wp14:editId="392DB683">
-            <wp:extent cx="5032984" cy="3351968"/>
-            <wp:effectExtent l="0" t="0" r="0" b="1270"/>
-            <wp:docPr id="574660198" name="Picture 1"/>
-            <wp:cNvGraphicFramePr>
-              <a:graphicFrameLocks xmlns:a="http://schemas.openxmlformats.org/drawingml/2006/main" noChangeAspect="1"/>
-            </wp:cNvGraphicFramePr>
-            <a:graphic xmlns:a="http://schemas.openxmlformats.org/drawingml/2006/main">
-              <a:graphicData uri="http://schemas.openxmlformats.org/drawingml/2006/picture">
-                <pic:pic xmlns:pic="http://schemas.openxmlformats.org/drawingml/2006/picture">
-                  <pic:nvPicPr>
-                    <pic:cNvPr id="0" name="Picture 1"/>
-                    <pic:cNvPicPr>
-                      <a:picLocks noChangeAspect="1" noChangeArrowheads="1"/>
-                    </pic:cNvPicPr>
-                  </pic:nvPicPr>
-                  <pic:blipFill>
-                    <a:blip r:embed="rId13" cstate="print">
-                      <a:extLst>
-                        <a:ext uri="{28A0092B-C50C-407E-A947-70E740481C1C}">
-                          <a14:useLocalDpi xmlns:a14="http://schemas.microsoft.com/office/drawing/2010/main" val="0"/>
-                        </a:ext>
-                      </a:extLst>
-                    </a:blip>
-                    <a:srcRect/>
-                    <a:stretch>
-                      <a:fillRect/>
-                    </a:stretch>
-                  </pic:blipFill>
-                  <pic:spPr bwMode="auto">
-                    <a:xfrm>
-                      <a:off x="0" y="0"/>
-                      <a:ext cx="5068836" cy="3375845"/>
-                    </a:xfrm>
-                    <a:prstGeom prst="rect">
-                      <a:avLst/>
-                    </a:prstGeom>
-                    <a:noFill/>
-                    <a:ln>
-                      <a:noFill/>
-                    </a:ln>
-                  </pic:spPr>
-                </pic:pic>
-              </a:graphicData>
-            </a:graphic>
-          </wp:inline>
-        </w:drawing>
-      </w:r>
-      <w:r>
-        <w:rPr>
-          <w:b/>
-          <w:bCs/>
-          <w:color w:val="000000"/>
-          <w:bdr w:val="none" w:sz="0" w:space="0" w:color="auto" w:frame="1"/>
-        </w:rPr>
-        <w:fldChar w:fldCharType="end"/>
       </w:r>
     </w:p>
     <w:sectPr>

</xml_diff>